<commit_message>
feat(Lab 3-4): completed Product CRUD implementation and submission documentation with HTML file included
</commit_message>
<xml_diff>
--- a/Assignment Part 1 report.docx
+++ b/Assignment Part 1 report.docx
@@ -17617,6 +17617,38 @@
           <w:color w:val="1F1F1F"/>
           <w:sz w:val="24"/>
           <w:szCs w:val="24"/>
+        </w:rPr>
+        <w:br/>
+      </w:r>
+      <w:r>
+        <w:rPr>
+          <w:rFonts w:ascii="Times New Roman" w:hAnsi="Times New Roman"/>
+          <w:b/>
+          <w:sz w:val="32"/>
+        </w:rPr>
+        <w:t>Lab 3 &amp; 4</w:t>
+      </w:r>
+      <w:r>
+        <w:rPr>
+          <w:rFonts w:ascii="Times New Roman" w:hAnsi="Times New Roman"/>
+          <w:b/>
+          <w:sz w:val="32"/>
+        </w:rPr>
+        <w:t xml:space="preserve"> Constructions of Input and Output (refer to the code part in another Word document)</w:t>
+      </w:r>
+      <w:r>
+        <w:rPr>
+          <w:rFonts w:ascii="Times New Roman" w:hAnsi="Times New Roman"/>
+          <w:b/>
+          <w:sz w:val="32"/>
+        </w:rPr>
+        <w:br/>
+      </w:r>
+      <w:r>
+        <w:rPr>
+          <w:rFonts w:ascii="Times New Roman" w:hAnsi="Times New Roman"/>
+          <w:b/>
+          <w:sz w:val="32"/>
         </w:rPr>
         <w:br/>
       </w:r>
@@ -19173,7 +19205,7 @@
 </file>
 
 <file path=customXml/itemProps1.xml><?xml version="1.0" encoding="utf-8"?>
-<ds:datastoreItem xmlns:ds="http://schemas.openxmlformats.org/officeDocument/2006/customXml" ds:itemID="{E3A5858B-4773-4B72-9929-8378529882BA}">
+<ds:datastoreItem xmlns:ds="http://schemas.openxmlformats.org/officeDocument/2006/customXml" ds:itemID="{3BC418B3-0343-40AC-965F-4C3D61D0D653}">
   <ds:schemaRefs>
     <ds:schemaRef ds:uri="http://schemas.openxmlformats.org/officeDocument/2006/bibliography"/>
   </ds:schemaRefs>

</xml_diff>

<commit_message>
Update: added warm instructions for the coding part and website result in GitHub (HTML file)
</commit_message>
<xml_diff>
--- a/Assignment Part 1 report.docx
+++ b/Assignment Part 1 report.docx
@@ -17634,14 +17634,32 @@
           <w:b/>
           <w:sz w:val="32"/>
         </w:rPr>
-        <w:t xml:space="preserve"> Constructions of Input and Output (refer to the code part in another Word document)</w:t>
+        <w:t xml:space="preserve"> Constructions of Input and Output (refer to the code part in </w:t>
       </w:r>
+      <w:r>
+        <w:rPr>
+          <w:rFonts w:ascii="Times New Roman" w:hAnsi="Times New Roman" w:hint="eastAsia"/>
+          <w:b/>
+          <w:sz w:val="32"/>
+        </w:rPr>
+        <w:t>Github</w:t>
+      </w:r>
+      <w:bookmarkStart w:id="0" w:name="_GoBack"/>
+      <w:bookmarkEnd w:id="0"/>
       <w:r>
         <w:rPr>
           <w:rFonts w:ascii="Times New Roman" w:hAnsi="Times New Roman"/>
           <w:b/>
           <w:sz w:val="32"/>
         </w:rPr>
+        <w:t>)</w:t>
+      </w:r>
+      <w:r>
+        <w:rPr>
+          <w:rFonts w:ascii="Times New Roman" w:hAnsi="Times New Roman"/>
+          <w:b/>
+          <w:sz w:val="32"/>
+        </w:rPr>
         <w:br/>
       </w:r>
       <w:r>
@@ -17652,8 +17670,6 @@
         </w:rPr>
         <w:br/>
       </w:r>
-      <w:bookmarkStart w:id="0" w:name="_GoBack"/>
-      <w:bookmarkEnd w:id="0"/>
     </w:p>
     <w:sectPr>
       <w:pgSz w:w="11906" w:h="16838"/>
@@ -19205,7 +19221,7 @@
 </file>
 
 <file path=customXml/itemProps1.xml><?xml version="1.0" encoding="utf-8"?>
-<ds:datastoreItem xmlns:ds="http://schemas.openxmlformats.org/officeDocument/2006/customXml" ds:itemID="{3BC418B3-0343-40AC-965F-4C3D61D0D653}">
+<ds:datastoreItem xmlns:ds="http://schemas.openxmlformats.org/officeDocument/2006/customXml" ds:itemID="{DD42D64D-01C2-4DB8-97CF-D71B5AC23383}">
   <ds:schemaRefs>
     <ds:schemaRef ds:uri="http://schemas.openxmlformats.org/officeDocument/2006/bibliography"/>
   </ds:schemaRefs>

</xml_diff>